<commit_message>
Clarify Hamed contribution in Phase 3 documents
Identify Hamed Qayed’s version 02 contribution as Sections 3–5 in versions 02 and 04. Clarify that other members’ entries remain review assignments. Preserve all requirements, teammate rows, images, and other document contents.
</commit_message>
<xml_diff>
--- a/docs/Phase_3_02_Cumulative.docx
+++ b/docs/Phase_3_02_Cumulative.docx
@@ -175,7 +175,7 @@
                 <w:b/>
                 <w:sz w:val="19"/>
               </w:rPr>
-              <w:t>Assigned addition</w:t>
+              <w:t>Review or contribution</w:t>
             </w:r>
           </w:p>
         </w:tc>
@@ -460,7 +460,7 @@
                 <w:b w:val="0"/>
                 <w:sz w:val="19"/>
               </w:rPr>
-              <w:t>Stage 3  Diagram and core use cases</w:t>
+              <w:t>Version 02  Quality, rules, data, and permissions</w:t>
             </w:r>
           </w:p>
         </w:tc>
@@ -564,7 +564,7 @@
     <w:p/>
     <w:p>
       <w:r>
-        <w:t>These are review assignments. Each member reviews and revises their addition before committing it using their own identity. Repository: github.com/HamedQayed/cosc336-circular-campus-9.</w:t>
+        <w:t>Hamed contributed Sections 3 to 5 in version 02. Other rows are review assignments. Each member reviews and revises their own work before committing it using their own identity. Repository: github.com/HamedQayed/cosc336-circular-campus-9.</w:t>
       </w:r>
     </w:p>
     <w:p>

</xml_diff>